<commit_message>
Strengthen Serasa Experian role with team size, scope and clients
</commit_message>
<xml_diff>
--- a/Renato-Garcia-CV-EN.docx
+++ b/Renato-Garcia-CV-EN.docx
@@ -41,7 +41,7 @@
       <w:pPr>
         <w:spacing w:after="60"/>
       </w:pPr>
-      <w:hyperlink w:history="1" r:id="rId49h4hxuidy2clyji7rvci">
+      <w:hyperlink w:history="1" r:id="rIdzc3yiqo04rdvf21uj35cz">
         <w:r>
           <w:rPr>
             <w:rStyle w:val="Hyperlink"/>
@@ -58,7 +58,7 @@
         </w:rPr>
         <w:t xml:space="preserve"> · </w:t>
       </w:r>
-      <w:hyperlink w:history="1" r:id="rIdbzghpf4zqo6kwoea0ylwc">
+      <w:hyperlink w:history="1" r:id="rIdgtbns6nlauaozx70mjbca">
         <w:r>
           <w:rPr>
             <w:rStyle w:val="Hyperlink"/>
@@ -75,7 +75,7 @@
         </w:rPr>
         <w:t xml:space="preserve"> · </w:t>
       </w:r>
-      <w:hyperlink w:history="1" r:id="rIdqloy40fbjmfsup_nebcna">
+      <w:hyperlink w:history="1" r:id="rIdy_4a02lxqz36thj9axpmc">
         <w:r>
           <w:rPr>
             <w:rStyle w:val="Hyperlink"/>
@@ -696,41 +696,41 @@
           <w:sz w:val="20"/>
           <w:szCs w:val="20"/>
         </w:rPr>
-        <w:t xml:space="preserve">Technical lead of the biometrics platform team: defined the architecture and owned delivery quality.</w:t>
-      </w:r>
-    </w:p>
-    <w:p>
-      <w:pPr>
-        <w:pStyle w:val="ListParagraph"/>
-        <w:numPr>
-          <w:ilvl w:val="0"/>
-          <w:numId w:val="2"/>
-        </w:numPr>
-        <w:spacing w:after="20"/>
-      </w:pPr>
-      <w:r>
-        <w:rPr>
-          <w:sz w:val="20"/>
-          <w:szCs w:val="20"/>
-        </w:rPr>
-        <w:t xml:space="preserve">Ran technical alignment and requirements refinement with product and business stakeholders.</w:t>
-      </w:r>
-    </w:p>
-    <w:p>
-      <w:pPr>
-        <w:pStyle w:val="ListParagraph"/>
-        <w:numPr>
-          <w:ilvl w:val="0"/>
-          <w:numId w:val="2"/>
-        </w:numPr>
-        <w:spacing w:after="20"/>
-      </w:pPr>
-      <w:r>
-        <w:rPr>
-          <w:sz w:val="20"/>
-          <w:szCs w:val="20"/>
-        </w:rPr>
-        <w:t xml:space="preserve">Built microservices and asynchronous flows on AWS SQS/SNS for biometric data processing.</w:t>
+        <w:t xml:space="preserve">Led a biometrics platform team of 6 engineers and 1 QA, working alongside other product teams, at Brazil’s largest credit bureau.</w:t>
+      </w:r>
+    </w:p>
+    <w:p>
+      <w:pPr>
+        <w:pStyle w:val="ListParagraph"/>
+        <w:numPr>
+          <w:ilvl w:val="0"/>
+          <w:numId w:val="2"/>
+        </w:numPr>
+        <w:spacing w:after="20"/>
+      </w:pPr>
+      <w:r>
+        <w:rPr>
+          <w:sz w:val="20"/>
+          <w:szCs w:val="20"/>
+        </w:rPr>
+        <w:t xml:space="preserve">The platform verifies identity through facial biometrics and liveness for account opening and fraud prevention, used by clients such as Vivo, Claro and Itaú.</w:t>
+      </w:r>
+    </w:p>
+    <w:p>
+      <w:pPr>
+        <w:pStyle w:val="ListParagraph"/>
+        <w:numPr>
+          <w:ilvl w:val="0"/>
+          <w:numId w:val="2"/>
+        </w:numPr>
+        <w:spacing w:after="20"/>
+      </w:pPr>
+      <w:r>
+        <w:rPr>
+          <w:sz w:val="20"/>
+          <w:szCs w:val="20"/>
+        </w:rPr>
+        <w:t xml:space="preserve">Owned the architecture and delivery quality of the team’s microservices; designed asynchronous processing on AWS SQS/SNS; coordinated technical alignment across teams and with product and business stakeholders.</w:t>
       </w:r>
     </w:p>
     <w:p>

</xml_diff>

<commit_message>
Update CV: results, team size and traffic numbers; simpler wording
</commit_message>
<xml_diff>
--- a/Renato-Garcia-CV-EN.docx
+++ b/Renato-Garcia-CV-EN.docx
@@ -25,7 +25,7 @@
           <w:sz w:val="21"/>
           <w:szCs w:val="21"/>
         </w:rPr>
-        <w:t xml:space="preserve">Software Architect | Distributed Systems &amp; Applied AI | Targeting Staff / Principal Engineer roles</w:t>
+        <w:t xml:space="preserve">Software Architect | Distributed Systems and Applied AI | Open to Staff and Principal Engineer roles</w:t>
       </w:r>
     </w:p>
     <w:p>
@@ -41,7 +41,7 @@
       <w:pPr>
         <w:spacing w:after="60"/>
       </w:pPr>
-      <w:hyperlink w:history="1" r:id="rIdzc3yiqo04rdvf21uj35cz">
+      <w:hyperlink w:history="1" r:id="rIdcwmiciputn9ba-jgjurhv">
         <w:r>
           <w:rPr>
             <w:rStyle w:val="Hyperlink"/>
@@ -58,7 +58,7 @@
         </w:rPr>
         <w:t xml:space="preserve"> · </w:t>
       </w:r>
-      <w:hyperlink w:history="1" r:id="rIdgtbns6nlauaozx70mjbca">
+      <w:hyperlink w:history="1" r:id="rIdv6-7mboslq0xp3_aklaed">
         <w:r>
           <w:rPr>
             <w:rStyle w:val="Hyperlink"/>
@@ -75,7 +75,7 @@
         </w:rPr>
         <w:t xml:space="preserve"> · </w:t>
       </w:r>
-      <w:hyperlink w:history="1" r:id="rIdy_4a02lxqz36thj9axpmc">
+      <w:hyperlink w:history="1" r:id="rIdlngzh4o1ayecgjbwovouw">
         <w:r>
           <w:rPr>
             <w:rStyle w:val="Hyperlink"/>
@@ -113,7 +113,7 @@
           <w:sz w:val="20"/>
           <w:szCs w:val="20"/>
         </w:rPr>
-        <w:t xml:space="preserve">Software architect with 20+ years building distributed systems, most of them integration platforms that move data reliably at volume. Architect of GuBee since day one: an event-driven hub on Apache Kafka connecting e-commerce platforms to 30+ Brazilian marketplaces, today about 170 production workloads. Founding engineer of INAI (Integra.do), a multi-agent LLM platform live in production since January 2026.</w:t>
+        <w:t xml:space="preserve">Software architect with 20 years of integration work, from ESB and SOA to Kafka and, more recently, AI agents. I designed GuBee’s marketplace integration platform (30+ marketplaces, about 1,300 requests per second) and built INAI, an AI platform that handles around 4,000 real-estate leads a month.</w:t>
       </w:r>
     </w:p>
     <w:p>
@@ -125,7 +125,7 @@
           <w:sz w:val="20"/>
           <w:szCs w:val="20"/>
         </w:rPr>
-        <w:t xml:space="preserve">I set technical direction across teams (architecture standards, cloud and platform migrations, roadmap), lead AI products from framework choice to production, and stay hands-on in Java and Kotlin.</w:t>
+        <w:t xml:space="preserve">I lead technical direction and large migrations, hired and run the engineering team, and still write a good share of the code in Java and Kotlin.</w:t>
       </w:r>
     </w:p>
     <w:p>
@@ -305,7 +305,7 @@
           <w:sz w:val="21"/>
           <w:szCs w:val="21"/>
         </w:rPr>
-        <w:t xml:space="preserve">Founding Engineer &amp; AI Architect — Integra.do (INAI)</w:t>
+        <w:t xml:space="preserve">Founding Engineer &amp; AI Architect | Integra.do (INAI)</w:t>
       </w:r>
       <w:r>
         <w:rPr>
@@ -330,126 +330,109 @@
           <w:sz w:val="19"/>
           <w:szCs w:val="19"/>
         </w:rPr>
-        <w:t xml:space="preserve">Remote</w:t>
-      </w:r>
-    </w:p>
-    <w:p>
-      <w:pPr>
-        <w:pStyle w:val="ListParagraph"/>
-        <w:numPr>
-          <w:ilvl w:val="0"/>
-          <w:numId w:val="2"/>
-        </w:numPr>
-        <w:spacing w:after="20"/>
-      </w:pPr>
-      <w:r>
-        <w:rPr>
-          <w:sz w:val="20"/>
-          <w:szCs w:val="20"/>
-        </w:rPr>
-        <w:t xml:space="preserve">Architected and built INAI from the first commit: a multi-agent LLM platform that qualifies and serves real-estate leads 24/7 on WhatsApp, live in production since January 2026 at Imobiliária Inglaterra (launch client).</w:t>
-      </w:r>
-    </w:p>
-    <w:p>
-      <w:pPr>
-        <w:pStyle w:val="ListParagraph"/>
-        <w:numPr>
-          <w:ilvl w:val="0"/>
-          <w:numId w:val="2"/>
-        </w:numPr>
-        <w:spacing w:after="20"/>
-      </w:pPr>
-      <w:r>
-        <w:rPr>
-          <w:sz w:val="20"/>
-          <w:szCs w:val="20"/>
-        </w:rPr>
-        <w:t xml:space="preserve">Designed the multi-agent core: 5 specialist agents (SDR, billing, support, maintenance, launches) behind a hybrid router (keyword + semantic + session affinity, LLM tie-break) with agent-to-agent handoff and per-tenant overrides.</w:t>
-      </w:r>
-    </w:p>
-    <w:p>
-      <w:pPr>
-        <w:pStyle w:val="ListParagraph"/>
-        <w:numPr>
-          <w:ilvl w:val="0"/>
-          <w:numId w:val="2"/>
-        </w:numPr>
-        <w:spacing w:after="20"/>
-      </w:pPr>
-      <w:r>
-        <w:rPr>
-          <w:sz w:val="20"/>
-          <w:szCs w:val="20"/>
-        </w:rPr>
-        <w:t xml:space="preserve">Built zero-loss WhatsApp ingestion on Redis Streams (consumer groups, pending-entry recovery, per-tenant debounce) and lead ingestion from ZAP, VivaReal, OLX and ImovelWeb with deduplication and replay protection.</w:t>
-      </w:r>
-    </w:p>
-    <w:p>
-      <w:pPr>
-        <w:pStyle w:val="ListParagraph"/>
-        <w:numPr>
-          <w:ilvl w:val="0"/>
-          <w:numId w:val="2"/>
-        </w:numPr>
-        <w:spacing w:after="20"/>
-      </w:pPr>
-      <w:r>
-        <w:rPr>
-          <w:sz w:val="20"/>
-          <w:szCs w:val="20"/>
-        </w:rPr>
-        <w:t xml:space="preserve">Implemented retrieval and agent runtime: hybrid search (pgvector + SQL + full text, RRF) with a local ONNX reranker, dynamic tools (HTTP, sandboxed GraalJS, MCP), three-layer memory, semantic LLM cache and two-tier guardrails.</w:t>
-      </w:r>
-    </w:p>
-    <w:p>
-      <w:pPr>
-        <w:pStyle w:val="ListParagraph"/>
-        <w:numPr>
-          <w:ilvl w:val="0"/>
-          <w:numId w:val="2"/>
-        </w:numPr>
-        <w:spacing w:after="20"/>
-      </w:pPr>
-      <w:r>
-        <w:rPr>
-          <w:sz w:val="20"/>
-          <w:szCs w:val="20"/>
-        </w:rPr>
-        <w:t xml:space="preserve">Controlled LLM cost with four model tiers by task and 11 Grafana dashboards tracking cost, latency and prompt-cache hit ratio per tenant (OpenTelemetry, Prometheus).</w:t>
-      </w:r>
-    </w:p>
-    <w:p>
-      <w:pPr>
-        <w:pStyle w:val="ListParagraph"/>
-        <w:numPr>
-          <w:ilvl w:val="0"/>
-          <w:numId w:val="2"/>
-        </w:numPr>
-        <w:spacing w:after="20"/>
-      </w:pPr>
-      <w:r>
-        <w:rPr>
-          <w:sz w:val="20"/>
-          <w:szCs w:val="20"/>
-        </w:rPr>
-        <w:t xml:space="preserve">Led a hardening milestone: tenant isolation on 43 controllers, BCrypt API keys migrated with a dual-read window, ~200 blocking calls removed; ~3,200 automated tests.</w:t>
-      </w:r>
-    </w:p>
-    <w:p>
-      <w:pPr>
-        <w:pStyle w:val="ListParagraph"/>
-        <w:numPr>
-          <w:ilvl w:val="0"/>
-          <w:numId w:val="2"/>
-        </w:numPr>
-        <w:spacing w:after="20"/>
-      </w:pPr>
-      <w:r>
-        <w:rPr>
-          <w:sz w:val="20"/>
-          <w:szCs w:val="20"/>
-        </w:rPr>
-        <w:t xml:space="preserve">Wrote ~70% of 2,400+ commits and every architecture and roadmap document (multi-tenant SaaS, admin/RBAC, CRM connectors, SSO, SDKs).</w:t>
+        <w:t xml:space="preserve">GuBee group · Remote</w:t>
+      </w:r>
+    </w:p>
+    <w:p>
+      <w:pPr>
+        <w:pStyle w:val="ListParagraph"/>
+        <w:numPr>
+          <w:ilvl w:val="0"/>
+          <w:numId w:val="2"/>
+        </w:numPr>
+        <w:spacing w:after="20"/>
+      </w:pPr>
+      <w:r>
+        <w:rPr>
+          <w:sz w:val="20"/>
+          <w:szCs w:val="20"/>
+        </w:rPr>
+        <w:t xml:space="preserve">Designed and built INAI from scratch. Its agents reply to real-estate leads on WhatsApp at any hour, qualify them and pass the good ones to brokers. Imobiliária Inglaterra has used it since January 2026, with about 4,000 leads a month.</w:t>
+      </w:r>
+    </w:p>
+    <w:p>
+      <w:pPr>
+        <w:pStyle w:val="ListParagraph"/>
+        <w:numPr>
+          <w:ilvl w:val="0"/>
+          <w:numId w:val="2"/>
+        </w:numPr>
+        <w:spacing w:after="20"/>
+      </w:pPr>
+      <w:r>
+        <w:rPr>
+          <w:sz w:val="20"/>
+          <w:szCs w:val="20"/>
+        </w:rPr>
+        <w:t xml:space="preserve">Split the work among five agents (sales, billing, support, maintenance and new launches) with a router between them, which kept each agent small enough to test properly.</w:t>
+      </w:r>
+    </w:p>
+    <w:p>
+      <w:pPr>
+        <w:pStyle w:val="ListParagraph"/>
+        <w:numPr>
+          <w:ilvl w:val="0"/>
+          <w:numId w:val="2"/>
+        </w:numPr>
+        <w:spacing w:after="20"/>
+      </w:pPr>
+      <w:r>
+        <w:rPr>
+          <w:sz w:val="20"/>
+          <w:szCs w:val="20"/>
+        </w:rPr>
+        <w:t xml:space="preserve">Built the WhatsApp and portal intake (ZAP, VivaReal, OLX, ImovelWeb) so leads are not lost or duplicated when something fails (Redis Streams, deduplication).</w:t>
+      </w:r>
+    </w:p>
+    <w:p>
+      <w:pPr>
+        <w:pStyle w:val="ListParagraph"/>
+        <w:numPr>
+          <w:ilvl w:val="0"/>
+          <w:numId w:val="2"/>
+        </w:numPr>
+        <w:spacing w:after="20"/>
+      </w:pPr>
+      <w:r>
+        <w:rPr>
+          <w:sz w:val="20"/>
+          <w:szCs w:val="20"/>
+        </w:rPr>
+        <w:t xml:space="preserve">Property search that mixes vector (pgvector), SQL and text results with local reranking; dynamic tools over HTTP and MCP; conversation memory and guardrails.</w:t>
+      </w:r>
+    </w:p>
+    <w:p>
+      <w:pPr>
+        <w:pStyle w:val="ListParagraph"/>
+        <w:numPr>
+          <w:ilvl w:val="0"/>
+          <w:numId w:val="2"/>
+        </w:numPr>
+        <w:spacing w:after="20"/>
+      </w:pPr>
+      <w:r>
+        <w:rPr>
+          <w:sz w:val="20"/>
+          <w:szCs w:val="20"/>
+        </w:rPr>
+        <w:t xml:space="preserve">Picked a model size per task and put cost and latency per client on Grafana dashboards, which kept the LLM bill under control.</w:t>
+      </w:r>
+    </w:p>
+    <w:p>
+      <w:pPr>
+        <w:pStyle w:val="ListParagraph"/>
+        <w:numPr>
+          <w:ilvl w:val="0"/>
+          <w:numId w:val="2"/>
+        </w:numPr>
+        <w:spacing w:after="20"/>
+      </w:pPr>
+      <w:r>
+        <w:rPr>
+          <w:sz w:val="20"/>
+          <w:szCs w:val="20"/>
+        </w:rPr>
+        <w:t xml:space="preserve">Wrote about 70% of the 2,400+ commits and the architecture and roadmap docs; about 3,200 automated tests.</w:t>
       </w:r>
     </w:p>
     <w:p>
@@ -488,7 +471,7 @@
           <w:sz w:val="21"/>
           <w:szCs w:val="21"/>
         </w:rPr>
-        <w:t xml:space="preserve">Software Architect — GuBee</w:t>
+        <w:t xml:space="preserve">Software Architect | GuBee</w:t>
       </w:r>
       <w:r>
         <w:rPr>
@@ -530,92 +513,92 @@
           <w:sz w:val="20"/>
           <w:szCs w:val="20"/>
         </w:rPr>
-        <w:t xml:space="preserve">Own the architecture of an integration hub connecting e-commerce platforms (VTEX, Shopify, Magento, WooCommerce) to 30+ marketplaces (Mercado Livre, Amazon, Magalu, Shopee): about 170 production workloads on an event-driven Apache Kafka backbone with Redis and MongoDB.</w:t>
-      </w:r>
-    </w:p>
-    <w:p>
-      <w:pPr>
-        <w:pStyle w:val="ListParagraph"/>
-        <w:numPr>
-          <w:ilvl w:val="0"/>
-          <w:numId w:val="2"/>
-        </w:numPr>
-        <w:spacing w:after="20"/>
-      </w:pPr>
-      <w:r>
-        <w:rPr>
-          <w:sz w:val="20"/>
-          <w:szCs w:val="20"/>
-        </w:rPr>
-        <w:t xml:space="preserve">Planned and lead the cloud migration from Huawei Cloud to Tencent Cloud: ~170 workloads, 36+ MongoDB databases and 25+ Kafka consumer groups, cut over behind feature flags with rollback at every step; wrote the playbooks that let several engineers migrate services in parallel.</w:t>
-      </w:r>
-    </w:p>
-    <w:p>
-      <w:pPr>
-        <w:pStyle w:val="ListParagraph"/>
-        <w:numPr>
-          <w:ilvl w:val="0"/>
-          <w:numId w:val="2"/>
-        </w:numPr>
-        <w:spacing w:after="20"/>
-      </w:pPr>
-      <w:r>
-        <w:rPr>
-          <w:sz w:val="20"/>
-          <w:szCs w:val="20"/>
-        </w:rPr>
-        <w:t xml:space="preserve">Drive fleet-wide modernisation: Java 25, Quarkus native with GraalVM (over 60% less memory per service), and OpenTelemetry traces, metrics and logs on Grafana Tempo, Loki and Mimir.</w:t>
-      </w:r>
-    </w:p>
-    <w:p>
-      <w:pPr>
-        <w:pStyle w:val="ListParagraph"/>
-        <w:numPr>
-          <w:ilvl w:val="0"/>
-          <w:numId w:val="2"/>
-        </w:numPr>
-        <w:spacing w:after="20"/>
-      </w:pPr>
-      <w:r>
-        <w:rPr>
-          <w:sz w:val="20"/>
-          <w:szCs w:val="20"/>
-        </w:rPr>
-        <w:t xml:space="preserve">Lead GuBee’s AI products on JetBrains Koog, chosen after head-to-head POCs against Embabel, LangChain4j and Spring AI: conversational commerce on WhatsApp (discovery to PIX checkout) and AI catalog enrichment with human-in-the-loop; quality gated by DeepEval (faithfulness, refusal, prompt injection).</w:t>
-      </w:r>
-    </w:p>
-    <w:p>
-      <w:pPr>
-        <w:pStyle w:val="ListParagraph"/>
-        <w:numPr>
-          <w:ilvl w:val="0"/>
-          <w:numId w:val="2"/>
-        </w:numPr>
-        <w:spacing w:after="20"/>
-      </w:pPr>
-      <w:r>
-        <w:rPr>
-          <w:sz w:val="20"/>
-          <w:szCs w:val="20"/>
-        </w:rPr>
-        <w:t xml:space="preserve">Built the company’s AI engineering toolkit: 15 Claude Code plugins for migrations, scaffolding, troubleshooting and architecture checks, so every team applies the same standards.</w:t>
-      </w:r>
-    </w:p>
-    <w:p>
-      <w:pPr>
-        <w:pStyle w:val="ListParagraph"/>
-        <w:numPr>
-          <w:ilvl w:val="0"/>
-          <w:numId w:val="2"/>
-        </w:numPr>
-        <w:spacing w:after="20"/>
-      </w:pPr>
-      <w:r>
-        <w:rPr>
-          <w:sz w:val="20"/>
-          <w:szCs w:val="20"/>
-        </w:rPr>
-        <w:t xml:space="preserve">Grew and lead the engineering team; set Hexagonal Architecture, DDD and TDD as the default.</w:t>
+        <w:t xml:space="preserve">Designed and still own the architecture of the integration hub between e-commerce platforms and 30+ marketplaces (Mercado Livre, Amazon, Magalu, Shopee). It runs on Kafka and handles about 1,300 requests per second across roughly 170 services.</w:t>
+      </w:r>
+    </w:p>
+    <w:p>
+      <w:pPr>
+        <w:pStyle w:val="ListParagraph"/>
+        <w:numPr>
+          <w:ilvl w:val="0"/>
+          <w:numId w:val="2"/>
+        </w:numPr>
+        <w:spacing w:after="20"/>
+      </w:pPr>
+      <w:r>
+        <w:rPr>
+          <w:sz w:val="20"/>
+          <w:szCs w:val="20"/>
+        </w:rPr>
+        <w:t xml:space="preserve">Leading the move from Huawei Cloud to Tencent Cloud to lower infrastructure cost: about 170 services, 36 MongoDB databases and 25 Kafka consumer groups, switched over one by one with feature flags and a rollback plan for each.</w:t>
+      </w:r>
+    </w:p>
+    <w:p>
+      <w:pPr>
+        <w:pStyle w:val="ListParagraph"/>
+        <w:numPr>
+          <w:ilvl w:val="0"/>
+          <w:numId w:val="2"/>
+        </w:numPr>
+        <w:spacing w:after="20"/>
+      </w:pPr>
+      <w:r>
+        <w:rPr>
+          <w:sz w:val="20"/>
+          <w:szCs w:val="20"/>
+        </w:rPr>
+        <w:t xml:space="preserve">Moved services to Quarkus native, which cut memory use per service by more than 60%, and added OpenTelemetry tracing, metrics and logs across the platform.</w:t>
+      </w:r>
+    </w:p>
+    <w:p>
+      <w:pPr>
+        <w:pStyle w:val="ListParagraph"/>
+        <w:numPr>
+          <w:ilvl w:val="0"/>
+          <w:numId w:val="2"/>
+        </w:numPr>
+        <w:spacing w:after="20"/>
+      </w:pPr>
+      <w:r>
+        <w:rPr>
+          <w:sz w:val="20"/>
+          <w:szCs w:val="20"/>
+        </w:rPr>
+        <w:t xml:space="preserve">Compared four agent frameworks and chose JetBrains Koog for our AI products: a WhatsApp sales assistant that goes all the way to PIX payment, and automatic catalog enrichment with human review, both tested with DeepEval.</w:t>
+      </w:r>
+    </w:p>
+    <w:p>
+      <w:pPr>
+        <w:pStyle w:val="ListParagraph"/>
+        <w:numPr>
+          <w:ilvl w:val="0"/>
+          <w:numId w:val="2"/>
+        </w:numPr>
+        <w:spacing w:after="20"/>
+      </w:pPr>
+      <w:r>
+        <w:rPr>
+          <w:sz w:val="20"/>
+          <w:szCs w:val="20"/>
+        </w:rPr>
+        <w:t xml:space="preserve">Wrote 15 Claude Code plugins with our migration, scaffolding and troubleshooting steps, so other engineers can do that work without waiting for me.</w:t>
+      </w:r>
+    </w:p>
+    <w:p>
+      <w:pPr>
+        <w:pStyle w:val="ListParagraph"/>
+        <w:numPr>
+          <w:ilvl w:val="0"/>
+          <w:numId w:val="2"/>
+        </w:numPr>
+        <w:spacing w:after="20"/>
+      </w:pPr>
+      <w:r>
+        <w:rPr>
+          <w:sz w:val="20"/>
+          <w:szCs w:val="20"/>
+        </w:rPr>
+        <w:t xml:space="preserve">Hired and lead the engineering team (up to 9 people) and made hexagonal architecture, DDD and TDD our default.</w:t>
       </w:r>
     </w:p>
     <w:p>
@@ -654,7 +637,7 @@
           <w:sz w:val="21"/>
           <w:szCs w:val="21"/>
         </w:rPr>
-        <w:t xml:space="preserve">Tech Lead — Serasa Experian</w:t>
+        <w:t xml:space="preserve">Tech Lead | Serasa Experian</w:t>
       </w:r>
       <w:r>
         <w:rPr>
@@ -769,7 +752,7 @@
           <w:sz w:val="21"/>
           <w:szCs w:val="21"/>
         </w:rPr>
-        <w:t xml:space="preserve">System Architect — Atos</w:t>
+        <w:t xml:space="preserve">System Architect | Atos</w:t>
       </w:r>
       <w:r>
         <w:rPr>
@@ -884,7 +867,7 @@
           <w:sz w:val="21"/>
           <w:szCs w:val="21"/>
         </w:rPr>
-        <w:t xml:space="preserve">Software Architect &amp; Project Lead — Infracommerce</w:t>
+        <w:t xml:space="preserve">Software Architect &amp; Project Lead | Infracommerce</w:t>
       </w:r>
       <w:r>
         <w:rPr>
@@ -982,7 +965,7 @@
           <w:sz w:val="21"/>
           <w:szCs w:val="21"/>
         </w:rPr>
-        <w:t xml:space="preserve">Tech Lead — Accurate</w:t>
+        <w:t xml:space="preserve">Tech Lead | Accurate</w:t>
       </w:r>
       <w:r>
         <w:rPr>
@@ -1042,7 +1025,7 @@
           <w:sz w:val="21"/>
           <w:szCs w:val="21"/>
         </w:rPr>
-        <w:t xml:space="preserve">System Architect — Atos (client: Serasa)</w:t>
+        <w:t xml:space="preserve">System Architect | Atos (client: Serasa)</w:t>
       </w:r>
       <w:r>
         <w:rPr>
@@ -1102,7 +1085,7 @@
           <w:sz w:val="21"/>
           <w:szCs w:val="21"/>
         </w:rPr>
-        <w:t xml:space="preserve">Tech Lead — LINT</w:t>
+        <w:t xml:space="preserve">Tech Lead | LINT</w:t>
       </w:r>
       <w:r>
         <w:rPr>
@@ -1162,7 +1145,7 @@
           <w:sz w:val="21"/>
           <w:szCs w:val="21"/>
         </w:rPr>
-        <w:t xml:space="preserve">Systems Analyst — Amadeus IT Group</w:t>
+        <w:t xml:space="preserve">Systems Analyst | Amadeus IT Group</w:t>
       </w:r>
       <w:r>
         <w:rPr>
@@ -1206,7 +1189,7 @@
           <w:sz w:val="21"/>
           <w:szCs w:val="21"/>
         </w:rPr>
-        <w:t xml:space="preserve">Team Leader &amp; Quality Assurance — BSI Tecnologia</w:t>
+        <w:t xml:space="preserve">Team Leader &amp; Quality Assurance | BSI Tecnologia</w:t>
       </w:r>
       <w:r>
         <w:rPr>
@@ -1384,7 +1367,7 @@
           <w:sz w:val="20"/>
           <w:szCs w:val="20"/>
         </w:rPr>
-        <w:t xml:space="preserve">Postgraduate, Computer Software Engineering — Unifil — Centro Universitário Filadélfia</w:t>
+        <w:t xml:space="preserve">Postgraduate, Computer Software Engineering, Unifil (Centro Universitário Filadélfia)</w:t>
       </w:r>
       <w:r>
         <w:rPr>
@@ -1406,7 +1389,7 @@
           <w:sz w:val="20"/>
           <w:szCs w:val="20"/>
         </w:rPr>
-        <w:t xml:space="preserve">Bachelor of Science, Information Systems — Universidade Tecnológica Federal do Paraná (UTFPR)</w:t>
+        <w:t xml:space="preserve">Bachelor of Science, Information Systems, Universidade Tecnológica Federal do Paraná (UTFPR)</w:t>
       </w:r>
       <w:r>
         <w:rPr>

</xml_diff>